<commit_message>
Remove campo de identificação acadêmica da capa da documentação do RA1
A capa passa a listar apenas os nomes da equipe e o checklist final fica completo.
</commit_message>
<xml_diff>
--- a/docs/RA1_documentacao_preenchida.docx
+++ b/docs/RA1_documentacao_preenchida.docx
@@ -123,13 +123,7 @@
       </w:r>
       <w:r>
         <w:rPr/>
-        <w:t xml:space="preserve">Caetano Padoin • Davi Henrique • Matheus Brehm  </w:t>
-      </w:r>
-      <w:r>
-        <w:rPr>
-          <w:highlight w:val="yellow"/>
-        </w:rPr>
-        <w:t>[identificação acadêmica de cada integrante]</w:t>
+        <w:t>Caetano Padoin • Davi Henrique • Matheus Brehm</w:t>
       </w:r>
     </w:p>
     <w:p>
@@ -8229,7 +8223,7 @@
     </w:p>
     <w:p>
       <w:r>
-        <w:t>☐  Os campos-modelo foram preenchidos e os exemplos revisados.</w:t>
+        <w:t>☑  Os campos-modelo foram preenchidos e os exemplos revisados.</w:t>
       </w:r>
     </w:p>
     <w:sectPr>

</xml_diff>